<commit_message>
docs: menyisipkan gambar bukti UI, git commit, PR, dan diagram SDLC pada lembar jawaban
</commit_message>
<xml_diff>
--- a/Lembar_Jawaban_UTS_RPL_240104013_Yusuf_Rizal_Indrianto.docx
+++ b/Lembar_Jawaban_UTS_RPL_240104013_Yusuf_Rizal_Indrianto.docx
@@ -1960,6 +1960,42 @@
               <w:t>Sistem mendukung pendaftaran permohonan baru, perhitungan biaya administrasi otomatis, pelacakan status dengan NIM, dan antrean data rekapitulasi BAAK.</w:t>
             </w:r>
           </w:p>
+          <w:p>
+            <w:r>
+              <w:drawing>
+                <wp:inline xmlns:a="http://schemas.openxmlformats.org/drawingml/2006/main" xmlns:pic="http://schemas.openxmlformats.org/drawingml/2006/picture">
+                  <wp:extent cx="5303520" cy="3349592"/>
+                  <wp:docPr id="1" name="Picture 1"/>
+                  <wp:cNvGraphicFramePr>
+                    <a:graphicFrameLocks noChangeAspect="1"/>
+                  </wp:cNvGraphicFramePr>
+                  <a:graphic>
+                    <a:graphicData uri="http://schemas.openxmlformats.org/drawingml/2006/picture">
+                      <pic:pic>
+                        <pic:nvPicPr>
+                          <pic:cNvPr id="0" name="bukti_halaman_php.png"/>
+                          <pic:cNvPicPr/>
+                        </pic:nvPicPr>
+                        <pic:blipFill>
+                          <a:blip r:embed="rId12"/>
+                          <a:stretch>
+                            <a:fillRect/>
+                          </a:stretch>
+                        </pic:blipFill>
+                        <pic:spPr>
+                          <a:xfrm>
+                            <a:off x="0" y="0"/>
+                            <a:ext cx="5303520" cy="3349592"/>
+                          </a:xfrm>
+                          <a:prstGeom prst="rect"/>
+                        </pic:spPr>
+                      </pic:pic>
+                    </a:graphicData>
+                  </a:graphic>
+                </wp:inline>
+              </w:drawing>
+            </w:r>
+          </w:p>
         </w:tc>
       </w:tr>
     </w:tbl>
@@ -2925,6 +2961,42 @@
               <w:t>$ git status -&gt; nothing to commit, working tree clean</w:t>
             </w:r>
           </w:p>
+          <w:p>
+            <w:r>
+              <w:drawing>
+                <wp:inline xmlns:a="http://schemas.openxmlformats.org/drawingml/2006/main" xmlns:pic="http://schemas.openxmlformats.org/drawingml/2006/picture">
+                  <wp:extent cx="5303520" cy="2902979"/>
+                  <wp:docPr id="2" name="Picture 2"/>
+                  <wp:cNvGraphicFramePr>
+                    <a:graphicFrameLocks noChangeAspect="1"/>
+                  </wp:cNvGraphicFramePr>
+                  <a:graphic>
+                    <a:graphicData uri="http://schemas.openxmlformats.org/drawingml/2006/picture">
+                      <pic:pic>
+                        <pic:nvPicPr>
+                          <pic:cNvPr id="0" name="bukti_git_commit_restore.png"/>
+                          <pic:cNvPicPr/>
+                        </pic:nvPicPr>
+                        <pic:blipFill>
+                          <a:blip r:embed="rId13"/>
+                          <a:stretch>
+                            <a:fillRect/>
+                          </a:stretch>
+                        </pic:blipFill>
+                        <pic:spPr>
+                          <a:xfrm>
+                            <a:off x="0" y="0"/>
+                            <a:ext cx="5303520" cy="2902979"/>
+                          </a:xfrm>
+                          <a:prstGeom prst="rect"/>
+                        </pic:spPr>
+                      </pic:pic>
+                    </a:graphicData>
+                  </a:graphic>
+                </wp:inline>
+              </w:drawing>
+            </w:r>
+          </w:p>
         </w:tc>
       </w:tr>
     </w:tbl>
@@ -3733,6 +3805,42 @@
               <w:t>Status: Merged into main</w:t>
               <w:br/>
               <w:t>Commit Resolusi Konflik: 3f9026a (fix(merge): penyelesaian konflik tarif biaya KTM hilang)</w:t>
+            </w:r>
+          </w:p>
+          <w:p>
+            <w:r>
+              <w:drawing>
+                <wp:inline xmlns:a="http://schemas.openxmlformats.org/drawingml/2006/main" xmlns:pic="http://schemas.openxmlformats.org/drawingml/2006/picture">
+                  <wp:extent cx="5303520" cy="3126285"/>
+                  <wp:docPr id="3" name="Picture 3"/>
+                  <wp:cNvGraphicFramePr>
+                    <a:graphicFrameLocks noChangeAspect="1"/>
+                  </wp:cNvGraphicFramePr>
+                  <a:graphic>
+                    <a:graphicData uri="http://schemas.openxmlformats.org/drawingml/2006/picture">
+                      <pic:pic>
+                        <pic:nvPicPr>
+                          <pic:cNvPr id="0" name="bukti_github_pr_conflict.png"/>
+                          <pic:cNvPicPr/>
+                        </pic:nvPicPr>
+                        <pic:blipFill>
+                          <a:blip r:embed="rId14"/>
+                          <a:stretch>
+                            <a:fillRect/>
+                          </a:stretch>
+                        </pic:blipFill>
+                        <pic:spPr>
+                          <a:xfrm>
+                            <a:off x="0" y="0"/>
+                            <a:ext cx="5303520" cy="3126285"/>
+                          </a:xfrm>
+                          <a:prstGeom prst="rect"/>
+                        </pic:spPr>
+                      </pic:pic>
+                    </a:graphicData>
+                  </a:graphic>
+                </wp:inline>
+              </w:drawing>
             </w:r>
           </w:p>
         </w:tc>
@@ -4879,6 +4987,42 @@
           <w:p>
             <w:r>
               <w:t>Alur Waterfall SDLC: [Analisis Kebutuhan BAAK] -&gt; [Perancangan Arsitektur &amp; Basis Data] -&gt; [Implementasi Kode &amp; REST API] -&gt; [Pengujian Sistem &amp; Deployment Vercel] -&gt; [Evaluasi &amp; Pemeliharaan]</w:t>
+            </w:r>
+          </w:p>
+          <w:p>
+            <w:r>
+              <w:drawing>
+                <wp:inline xmlns:a="http://schemas.openxmlformats.org/drawingml/2006/main" xmlns:pic="http://schemas.openxmlformats.org/drawingml/2006/picture">
+                  <wp:extent cx="5303520" cy="2940350"/>
+                  <wp:docPr id="4" name="Picture 4"/>
+                  <wp:cNvGraphicFramePr>
+                    <a:graphicFrameLocks noChangeAspect="1"/>
+                  </wp:cNvGraphicFramePr>
+                  <a:graphic>
+                    <a:graphicData uri="http://schemas.openxmlformats.org/drawingml/2006/picture">
+                      <pic:pic>
+                        <pic:nvPicPr>
+                          <pic:cNvPr id="0" name="diagram_sdlc_waterfall.png"/>
+                          <pic:cNvPicPr/>
+                        </pic:nvPicPr>
+                        <pic:blipFill>
+                          <a:blip r:embed="rId15"/>
+                          <a:stretch>
+                            <a:fillRect/>
+                          </a:stretch>
+                        </pic:blipFill>
+                        <pic:spPr>
+                          <a:xfrm>
+                            <a:off x="0" y="0"/>
+                            <a:ext cx="5303520" cy="2940350"/>
+                          </a:xfrm>
+                          <a:prstGeom prst="rect"/>
+                        </pic:spPr>
+                      </pic:pic>
+                    </a:graphicData>
+                  </a:graphic>
+                </wp:inline>
+              </w:drawing>
             </w:r>
           </w:p>
         </w:tc>

</xml_diff>